<commit_message>
Review quyển 1–5: sửa canon (L5, sẹo 11 cm, ruy băng, sổ bìa đen, Thạch Kiều); sửa chương 191–194
- Thay tên châu lục/Olympic thật ở Q1, Q2
- Tuổi bà nội ở chương 38
- Sẹo 11 cm, vít ở L5, L4 gánh thay (Q3–Q5)
- Nguồn gốc ruy băng đỏ, dải nhung đen, sổ bìa đen, Lăng ở Q6
- Thêm mục canon vào ghi chú; dựng lại docx quyển 1–5

Co-Authored-By: Claude Opus 5.5 <noreply@anthropic.com>
Claude-Session: https://claude.ai/code/session_01Dzjov9DvupqkiCaPa75wHH
</commit_message>
<xml_diff>
--- a/Quyen-1-Dong-phuc-va-loi-hua.docx
+++ b/Quyen-1-Dong-phuc-va-loi-hua.docx
@@ -30194,7 +30194,7 @@
         <w:jc w:val="both"/>
       </w:pPr>
       <w:r>
-        <w:t xml:space="preserve">Kỳ Phong đã nghe tên ông từ bé. Mẹ cậu có cả một ngăn tủ băng hình những bài nhảy do ông biên đạo. Ông từng là vận động viên Latin của Estherwyn, hai lần vô địch thế giới, giải nghệ năm ba mươi tuổi, rồi trở thành một trong những biên đạo được săn đón nhất thế giới. Ông đang giảng dạy tại Học viện Khiêu vũ Hoàng gia Estherwyn, học viện danh giá nhất châu Âu, nơi mỗi năm chỉ nhận mười hai học viên từ khắp thế giới.</w:t>
+        <w:t xml:space="preserve">Kỳ Phong đã nghe tên ông từ bé. Mẹ cậu có cả một ngăn tủ băng hình những bài nhảy do ông biên đạo. Ông từng là vận động viên Latin của Estherwyn, hai lần vô địch thế giới, giải nghệ năm ba mươi tuổi, rồi trở thành một trong những biên đạo được săn đón nhất thế giới. Ông đang giảng dạy tại Học viện Khiêu vũ Hoàng gia Estherwyn, học viện danh giá nhất lục địa phía Tây, nơi mỗi năm chỉ nhận mười hai học viên từ khắp thế giới.</w:t>
       </w:r>
     </w:p>
     <w:p>
@@ -33248,7 +33248,7 @@
           <w:i/>
           <w:iCs/>
         </w:rPr>
-        <w:t xml:space="preserve">Chương trình kéo dài năm năm. Học viên được cấp học bổng toàn phần, bao gồm học phí, ăn ở, trang phục, chi phí thi đấu quốc tế và trợ cấp sinh hoạt hằng tháng. Học viên sẽ được ghép cặp với vũ công phù hợp do Học viện tuyển chọn và thi đấu dưới sự bảo trợ của Học viện tại các giải đấu chuyên nghiệp châu Âu và thế giới.</w:t>
+        <w:t xml:space="preserve">Chương trình kéo dài năm năm. Học viên được cấp học bổng toàn phần, bao gồm học phí, ăn ở, trang phục, chi phí thi đấu quốc tế và trợ cấp sinh hoạt hằng tháng. Học viên sẽ được ghép cặp với vũ công phù hợp do Học viện tuyển chọn và thi đấu dưới sự bảo trợ của Học viện tại các giải đấu chuyên nghiệp khu vực phía Tây và thế giới.</w:t>
       </w:r>
     </w:p>
     <w:p>
@@ -50198,7 +50198,7 @@
           <w:i/>
           <w:iCs/>
         </w:rPr>
-        <w:t xml:space="preserve">Học viện Hoàng gia công bố cặp nhảy mới của mùa giải: Tân binh châu Á và "Nữ hoàng Jive" của Estherwyn.</w:t>
+        <w:t xml:space="preserve">Học viện Hoàng gia công bố cặp nhảy mới của mùa giải: Tân binh phương Đông và "Nữ hoàng Jive" của Estherwyn.</w:t>
       </w:r>
     </w:p>
     <w:p>
@@ -50275,7 +50275,7 @@
           <w:i/>
           <w:iCs/>
         </w:rPr>
-        <w:t xml:space="preserve">Isadora Wren, 19 tuổi, hai lần vô địch Jive trẻ châu Âu, sẽ ghép cặp với tân binh 17 tuổi người Tinh Lam, Tạ Kỳ Phong, người được thầy Lucien Ardois đặc cách tiến cử. Theo Isadora, cô đã thử nhảy với mười một ứng viên trước khi chọn Kỳ Phong. "Cậu ấy là người duy nhất không giẫm lên chân tôi," cô nói đùa.</w:t>
+        <w:t xml:space="preserve">Isadora Wren, 19 tuổi, hai lần vô địch Jive trẻ khu vực phía Tây, sẽ ghép cặp với tân binh 17 tuổi người Tinh Lam, Tạ Kỳ Phong, người được thầy Lucien Ardois đặc cách tiến cử. Theo Isadora, cô đã thử nhảy với mười một ứng viên trước khi chọn Kỳ Phong. "Cậu ấy là người duy nhất không giẫm lên chân tôi," cô nói đùa.</w:t>
       </w:r>
     </w:p>
     <w:p>
@@ -50685,7 +50685,7 @@
         <w:jc w:val="both"/>
       </w:pPr>
       <w:r>
-        <w:t xml:space="preserve">Mười hai học viên năm nhất. Từ mười một quốc gia. Kỳ Phong là người duy nhất đến từ châu Á.</w:t>
+        <w:t xml:space="preserve">Mười hai học viên năm nhất. Từ mười một quốc gia. Kỳ Phong là người duy nhất đến từ phương Đông.</w:t>
       </w:r>
     </w:p>
     <w:p>
@@ -50913,7 +50913,7 @@
         <w:jc w:val="both"/>
       </w:pPr>
       <w:r>
-        <w:t xml:space="preserve">"Cậu là cậu châu Á mà thầy Lucien cứ nói mãi à?" Cô hỏi, miệng đầy bánh mì, tiếng Estherwyn nhanh như súng liên thanh. "Tôi là Isadora. Mười chín tuổi. Hai lần vô địch Jive trẻ châu Âu. Bạn nhảy cũ của tôi vừa giải nghệ tháng trước, đi làm biên đạo, và tôi sắp cưới anh ấy, nên đừng có ý định gì nhé. Tôi đã thử nhảy với mười một người. Mười một người giẫm lên chân tôi. Cậu có định giẫm lên chân tôi không?"</w:t>
+        <w:t xml:space="preserve">"Cậu là cậu phương Đông mà thầy Lucien cứ nói mãi à?" Cô hỏi, miệng đầy bánh mì, tiếng Estherwyn nhanh như súng liên thanh. "Tôi là Isadora. Mười chín tuổi. Hai lần vô địch Jive trẻ khu vực phía Tây. Bạn nhảy cũ của tôi vừa giải nghệ tháng trước, đi làm biên đạo, và tôi sắp cưới anh ấy, nên đừng có ý định gì nhé. Tôi đã thử nhảy với mười một người. Mười một người giẫm lên chân tôi. Cậu có định giẫm lên chân tôi không?"</w:t>
       </w:r>
     </w:p>
     <w:p>
@@ -52034,7 +52034,7 @@
         <w:jc w:val="both"/>
       </w:pPr>
       <w:r>
-        <w:t xml:space="preserve">Cậu đi bộ ba cây số đến một khu phố nhỏ ở phía đông thành phố, nơi có những cửa hàng của người nhập cư châu Á. Cậu đi dọc con phố, vào từng cửa hàng tạp hóa, nhìn từng kệ hàng.</w:t>
+        <w:t xml:space="preserve">Cậu đi bộ ba cây số đến một khu phố nhỏ ở phía đông thành phố, nơi có những cửa hàng của người nhập cư phương Đông. Cậu đi dọc con phố, vào từng cửa hàng tạp hóa, nhìn từng kệ hàng.</w:t>
       </w:r>
     </w:p>
     <w:p>
@@ -53504,7 +53504,7 @@
         <w:jc w:val="both"/>
       </w:pPr>
       <w:r>
-        <w:t xml:space="preserve">"Tôi theo dõi thằng bé ở Estherwyn." Thầy Nghiêm nói. "Đứng thứ hai Cúp Mùa đông Aldmere. Vô địch hai giải mở rộng châu Âu trẻ. Samba, Cha-cha-cha, Jive, Paso Doble, điểm cao. Rumba thì..."</w:t>
+        <w:t xml:space="preserve">"Tôi theo dõi thằng bé ở Estherwyn." Thầy Nghiêm nói. "Đứng thứ hai Cúp Mùa đông Aldmere. Vô địch hai giải mở rộng trẻ khu vực phía Tây. Samba, Cha-cha-cha, Jive, Paso Doble, điểm cao. Rumba thì..."</w:t>
       </w:r>
     </w:p>
     <w:p>
@@ -54572,7 +54572,7 @@
         <w:jc w:val="both"/>
       </w:pPr>
       <w:r>
-        <w:t xml:space="preserve">Ngày hai mươi ba tháng Sáu, Kỳ Phong đi bộ ba cây số đến khu phố người nhập cư châu Á ở phía đông Aldmere.</w:t>
+        <w:t xml:space="preserve">Ngày hai mươi ba tháng Sáu, Kỳ Phong đi bộ ba cây số đến khu phố người nhập cư phương Đông ở phía đông Aldmere.</w:t>
       </w:r>
     </w:p>
     <w:p>
@@ -61463,7 +61463,7 @@
         <w:jc w:val="both"/>
       </w:pPr>
       <w:r>
-        <w:t xml:space="preserve">"Cậu sẽ làm gì?" Cô hỏi, giọng nghẹn trên vai anh. "Học viện sẽ tìm bạn nhảy mới cho cậu. Thầy Lucien đã có danh sách rồi. Ba cô gái. Cả ba đều giỏi. Một người còn vô địch Rumba châu Âu."</w:t>
+        <w:t xml:space="preserve">"Cậu sẽ làm gì?" Cô hỏi, giọng nghẹn trên vai anh. "Học viện sẽ tìm bạn nhảy mới cho cậu. Thầy Lucien đã có danh sách rồi. Ba cô gái. Cả ba đều giỏi. Một người còn vô địch Rumba khu vực phía Tây."</w:t>
       </w:r>
     </w:p>
     <w:p>

</xml_diff>